<commit_message>
Alinea el texto del acta con el proyecto CRM conservando las firmas
Co-Authored-By: Claude Opus 5.5 <noreply@anthropic.com>
Claude-Session: https://claude.ai/code/session_01LWjTm2rp677phoNoYSvNSp
</commit_message>
<xml_diff>
--- a/docs/Acta_Constitucion_Essenza_SPA_v2.docx
+++ b/docs/Acta_Constitucion_Essenza_SPA_v2.docx
@@ -49,12 +49,13 @@
           <w:sz w:val="26"/>
           <w:szCs w:val="26"/>
         </w:rPr>
-        <w:t xml:space="preserve">Programa Integral de Fidelización y Experiencia del Cliente — Essenza SPA</w:t>
+        <w:t xml:space="preserve">Implementación del CRM Predictivo y Retención Postventa — Essenza SPA</w:t>
       </w:r>
     </w:p>
     <w:p>
       <w:pPr>
         <w:pStyle w:val="Ttulo1"/>
+        <w:keepNext/>
         <w:pBdr>
           <w:bottom w:val="single" w:sz="8" w:space="4" w:color="1F4E79"/>
         </w:pBdr>
@@ -133,7 +134,7 @@
           </w:tcPr>
           <w:p>
             <w:r>
-              <w:t xml:space="preserve">Programa Integral de Fidelización y Experiencia del Cliente — Essenza SPA</w:t>
+              <w:t xml:space="preserve">Implementación del CRM Predictivo y Retención Postventa — Essenza SPA</w:t>
             </w:r>
           </w:p>
         </w:tc>
@@ -179,7 +180,7 @@
           </w:tcPr>
           <w:p>
             <w:r>
-              <w:t xml:space="preserve">ESSENZA-FID-2026-001</w:t>
+              <w:t xml:space="preserve">ESSENZA-CRM-2026-001</w:t>
             </w:r>
           </w:p>
         </w:tc>
@@ -225,7 +226,7 @@
           </w:tcPr>
           <w:p>
             <w:r>
-              <w:t xml:space="preserve">Essenza SPA S.A.C. — Área de Marketing y Experiencia del Cliente</w:t>
+              <w:t xml:space="preserve">Essenza SPA S.A.C. — Administración y atención al cliente</w:t>
             </w:r>
           </w:p>
         </w:tc>
@@ -271,7 +272,7 @@
           </w:tcPr>
           <w:p>
             <w:r>
-              <w:t xml:space="preserve">Gerencia General de Essenza SPA S.A.C.</w:t>
+              <w:t xml:space="preserve">Gerencia General (dueña) de Essenza SPA S.A.C.</w:t>
             </w:r>
           </w:p>
         </w:tc>
@@ -317,7 +318,7 @@
           </w:tcPr>
           <w:p>
             <w:r>
-              <w:t>Leonardo (asignado por el patrocinador con las facultades descritas en la sección 12)</w:t>
+              <w:t xml:space="preserve">Fabrizio Renato Ríos Cáceres (asignado por el patrocinador con las facultades descritas en la sección 12)</w:t>
             </w:r>
           </w:p>
         </w:tc>
@@ -409,7 +410,7 @@
           </w:tcPr>
           <w:p>
             <w:r>
-              <w:t xml:space="preserve">Proyecto de mejora comercial y organizacional (no contempla desarrollo de software)</w:t>
+              <w:t xml:space="preserve">Proyecto de implementación de software: CRM web con modelo predictivo de abandono</w:t>
             </w:r>
           </w:p>
         </w:tc>
@@ -455,7 +456,7 @@
           </w:tcPr>
           <w:p>
             <w:r>
-              <w:t>Alta</w:t>
+              <w:t xml:space="preserve">Alta</w:t>
             </w:r>
           </w:p>
         </w:tc>
@@ -469,6 +470,7 @@
     <w:p>
       <w:pPr>
         <w:pStyle w:val="Ttulo1"/>
+        <w:keepNext/>
         <w:pBdr>
           <w:bottom w:val="single" w:sz="8" w:space="4" w:color="1F4E79"/>
         </w:pBdr>
@@ -491,7 +493,7 @@
         <w:jc w:val="both"/>
       </w:pPr>
       <w:r>
-        <w:t xml:space="preserve">Essenza SPA es un centro de bienestar y estética que ha experimentado un crecimiento sostenido en su cartera de clientes, pero cuya gestión comercial se apoya todavía en registros manuales, hojas de cálculo dispersas y agendas físicas. Esta situación genera pérdida de información de contacto, dificultad para dar seguimiento a los clientes recurrentes, promociones poco segmentadas y una baja tasa de retención frente a la competencia.</w:t>
+        <w:t xml:space="preserve">Essenza SPA es un centro de bienestar y estética que registra sus atenciones en una hoja de Excel llenada a mano. Hoy no puede saber qué clientes están dejando de venir: de sus 420 clientes, el 29,8 % lleva más de 120 días sin visitar el spa, las promociones son generales y el seguimiento postventa depende de la memoria del personal.</w:t>
       </w:r>
     </w:p>
     <w:p>
@@ -500,7 +502,7 @@
         <w:jc w:val="both"/>
       </w:pPr>
       <w:r>
-        <w:t xml:space="preserve">El presente proyecto tiene como propósito diseñar e implementar un Programa Integral de Fidelización y Experiencia del Cliente que estandarice los procesos de atención, organice la información de los clientes en un registro único, ponga en marcha un programa de membresía con niveles y beneficios, y establezca un protocolo de seguimiento y recuperación de clientes. Con ello se busca incrementar la retención de clientes, elevar la frecuencia de visita y mejorar la experiencia general del cliente, utilizando los recursos y herramientas con los que la empresa ya cuenta.</w:t>
+        <w:t xml:space="preserve">El presente proyecto tiene como propósito desarrollar e implementar el CRM Predictivo y Retención Postventa: una aplicación web de uso local que lea el Excel operacional, consolide el historial de cada cliente, estime su probabilidad de abandono con un modelo de machine learning y organice la respuesta del equipo en un Centro de Retención, con contacto personalizado por WhatsApp y respetando la protección de datos personales.</w:t>
       </w:r>
     </w:p>
     <w:p>
@@ -516,12 +518,13 @@
         <w:t xml:space="preserve">Caso de negocio (resumen): </w:t>
       </w:r>
       <w:r>
-        <w:t xml:space="preserve">la inversión se justifica por el aumento esperado de la recompra de clientes fidelizados, la reducción de la fuga de clientes hacia la competencia y una atención más ordenada y personalizada. El retorno se estima recuperable dentro del primer año de funcionamiento del programa.</w:t>
+        <w:t xml:space="preserve">recuperar el 15 % de los 216 clientes en riesgo medio o alto representa unos S/ 24 000 de ingresos al año. Con un costo de operación de S/ 3 600 anuales, la inversión se recupera en aproximadamente dos años, y el desembolso en efectivo del spa (equipos, materiales y reservas) en unos cuatro meses.</w:t>
       </w:r>
     </w:p>
     <w:p>
       <w:pPr>
         <w:pStyle w:val="Ttulo1"/>
+        <w:keepNext/>
         <w:pBdr>
           <w:bottom w:val="single" w:sz="8" w:space="4" w:color="1F4E79"/>
         </w:pBdr>
@@ -544,7 +547,7 @@
         <w:jc w:val="both"/>
       </w:pPr>
       <w:r>
-        <w:t xml:space="preserve">El proyecto contempla el diagnóstico, diseño, implementación y evaluación de un programa de fidelización y de mejora de la experiencia del cliente en las instalaciones de Essenza SPA. Los principales entregables son:</w:t>
+        <w:t xml:space="preserve">El proyecto contempla el análisis, diseño, construcción, pruebas, puesta en producción y transición a la operación del CRM en las instalaciones de Essenza SPA. Los principales entregables, que corresponden al segundo nivel de la EDT, son:</w:t>
       </w:r>
     </w:p>
     <w:p>
@@ -562,10 +565,10 @@
           <w:b/>
           <w:bCs/>
         </w:rPr>
-        <w:t xml:space="preserve">Diagnóstico de la situación actual: </w:t>
-      </w:r>
-      <w:r>
-        <w:t xml:space="preserve">encuesta de satisfacción a clientes, análisis de la cartera (clientes activos, inactivos y recurrentes) y mapeo del proceso de atención actual.</w:t>
+        <w:t xml:space="preserve">Gestión del proyecto: </w:t>
+      </w:r>
+      <w:r>
+        <w:t xml:space="preserve">acta de constitución, plan para la dirección del proyecto, informes de seguimiento y cierre.</w:t>
       </w:r>
     </w:p>
     <w:p>
@@ -583,10 +586,10 @@
           <w:b/>
           <w:bCs/>
         </w:rPr>
-        <w:t xml:space="preserve">Programa de membresía y beneficios: </w:t>
-      </w:r>
-      <w:r>
-        <w:t xml:space="preserve">niveles de membresía (Plata, Oro y Platino), tarjeta física de afiliación, reglas de acumulación y canje de beneficios, y catálogo de promociones por segmento.</w:t>
+        <w:t xml:space="preserve">Análisis y diseño: </w:t>
+      </w:r>
+      <w:r>
+        <w:t xml:space="preserve">requisitos priorizados, arquitectura, modelo de datos, prototipo de pantallas y reglas de retención.</w:t>
       </w:r>
     </w:p>
     <w:p>
@@ -604,11 +607,10 @@
           <w:b/>
           <w:bCs/>
         </w:rPr>
-        <w:lastRenderedPageBreak/>
-        <w:t xml:space="preserve">Manual de procesos y protocolos de atención: </w:t>
-      </w:r>
-      <w:r>
-        <w:t xml:space="preserve">protocolo de bienvenida, seguimiento post-servicio, atención de reclamos y recuperación de clientes inactivos.</w:t>
+        <w:t xml:space="preserve">Datos y modelo predictivo: </w:t>
+      </w:r>
+      <w:r>
+        <w:t xml:space="preserve">registro depurado, variables por cliente y modelo de abandono validado y explicable.</w:t>
       </w:r>
     </w:p>
     <w:p>
@@ -626,10 +628,10 @@
           <w:b/>
           <w:bCs/>
         </w:rPr>
-        <w:t xml:space="preserve">Registro único de clientes e indicadores: </w:t>
-      </w:r>
-      <w:r>
-        <w:t xml:space="preserve">ficha estandarizada del cliente, depuración de la información existente y tablero mensual de retención, frecuencia de visita y satisfacción.</w:t>
+        <w:t xml:space="preserve">Backend e integración: </w:t>
+      </w:r>
+      <w:r>
+        <w:t xml:space="preserve">base de datos, API con acceso por rol y sincronización automática con el Excel del spa.</w:t>
       </w:r>
     </w:p>
     <w:p>
@@ -647,10 +649,10 @@
           <w:b/>
           <w:bCs/>
         </w:rPr>
-        <w:t xml:space="preserve">Plan de comunicación y lanzamiento: </w:t>
-      </w:r>
-      <w:r>
-        <w:t xml:space="preserve">material promocional impreso y digital, campaña de lanzamiento del programa e informe final de resultados con acta de cierre.</w:t>
+        <w:t xml:space="preserve">Aplicación web CRM: </w:t>
+      </w:r>
+      <w:r>
+        <w:t xml:space="preserve">dashboard, listado de clientes, ficha 360° y centro de alertas.</w:t>
       </w:r>
     </w:p>
     <w:p>
@@ -668,15 +670,58 @@
           <w:b/>
           <w:bCs/>
         </w:rPr>
-        <w:t xml:space="preserve">Capacitación: </w:t>
-      </w:r>
-      <w:r>
-        <w:t xml:space="preserve">sesiones de entrenamiento al personal de recepción, terapeutas y administración en los nuevos protocolos y en el programa de membresía.</w:t>
+        <w:t xml:space="preserve">Módulo de retención: </w:t>
+      </w:r>
+      <w:r>
+        <w:t xml:space="preserve">casos priorizados, acción sugerida y contacto por WhatsApp con mensaje editable.</w:t>
+      </w:r>
+    </w:p>
+    <w:p>
+      <w:pPr>
+        <w:pStyle w:val="Prrafodelista"/>
+        <w:numPr>
+          <w:ilvl w:val="0"/>
+          <w:numId w:val="2"/>
+        </w:numPr>
+        <w:spacing w:after="60" w:line="276" w:lineRule="auto"/>
+        <w:jc w:val="both"/>
+      </w:pPr>
+      <w:r>
+        <w:rPr>
+          <w:b/>
+          <w:bCs/>
+        </w:rPr>
+        <w:t xml:space="preserve">Pruebas y calidad: </w:t>
+      </w:r>
+      <w:r>
+        <w:t xml:space="preserve">pruebas unitarias, de integración, del sistema y de aceptación con la usuaria líder.</w:t>
+      </w:r>
+    </w:p>
+    <w:p>
+      <w:pPr>
+        <w:pStyle w:val="Prrafodelista"/>
+        <w:numPr>
+          <w:ilvl w:val="0"/>
+          <w:numId w:val="2"/>
+        </w:numPr>
+        <w:spacing w:after="60" w:line="276" w:lineRule="auto"/>
+        <w:jc w:val="both"/>
+      </w:pPr>
+      <w:r>
+        <w:rPr>
+          <w:b/>
+          <w:bCs/>
+        </w:rPr>
+        <w:t xml:space="preserve">Despliegue y transición: </w:t>
+      </w:r>
+      <w:r>
+        <w:t xml:space="preserve">instalación en la PC del spa, respaldo diario, manuales, capacitación por rol y estabilización asistida.</w:t>
       </w:r>
     </w:p>
     <w:p>
       <w:pPr>
         <w:pStyle w:val="Ttulo1"/>
+        <w:keepNext/>
         <w:pBdr>
           <w:bottom w:val="single" w:sz="8" w:space="4" w:color="1F4E79"/>
         </w:pBdr>
@@ -706,7 +751,7 @@
         <w:t xml:space="preserve">Objetivo general: </w:t>
       </w:r>
       <w:r>
-        <w:t xml:space="preserve">diseñar e implementar el Programa Integral de Fidelización y Experiencia del Cliente de Essenza SPA en un plazo máximo de seis (6) meses, cumpliendo el alcance y presupuesto aprobados.</w:t>
+        <w:t xml:space="preserve">desarrollar e implementar en Essenza SPA un CRM web que prediga el riesgo de abandono de los clientes y apoye su retención postventa, con usuarias capacitadas y aceptación formal de la patrocinadora, entre el 15 de septiembre de 2026 y el 15 de enero de 2027 (cuatro meses), dentro del presupuesto autorizado.</w:t>
       </w:r>
     </w:p>
     <w:p>
@@ -836,7 +881,7 @@
                 <w:sz w:val="19"/>
                 <w:szCs w:val="19"/>
               </w:rPr>
-              <w:t>Alcance</w:t>
+              <w:t xml:space="preserve">Alcance</w:t>
             </w:r>
           </w:p>
         </w:tc>
@@ -861,7 +906,7 @@
                 <w:sz w:val="19"/>
                 <w:szCs w:val="19"/>
               </w:rPr>
-              <w:t xml:space="preserve">Entregar los seis entregables descritos en la sección 3, aprobados por el patrocinador en el acta de aceptación.</w:t>
+              <w:t xml:space="preserve">Entregar los 7 módulos del CRM (dashboard, clientes, ficha 360°, alertas, sincronización con Excel, modelo predictivo y Centro de Retención) aprobados en las pruebas de aceptación.</w:t>
             </w:r>
           </w:p>
         </w:tc>
@@ -876,50 +921,50 @@
         <w:tc>
           <w:tcPr>
             <w:tcW w:w="2600" w:type="dxa"/>
-            <w:shd w:val="clear" w:color="auto" w:fill="F2F2F2"/>
-            <w:tcMar>
-              <w:top w:w="50" w:type="dxa"/>
-              <w:left w:w="100" w:type="dxa"/>
-              <w:bottom w:w="50" w:type="dxa"/>
-              <w:right w:w="100" w:type="dxa"/>
-            </w:tcMar>
-            <w:vAlign w:val="center"/>
-          </w:tcPr>
-          <w:p>
-            <w:pPr>
-              <w:spacing w:line="260" w:lineRule="auto"/>
-            </w:pPr>
-            <w:r>
-              <w:rPr>
-                <w:sz w:val="19"/>
-                <w:szCs w:val="19"/>
-              </w:rPr>
-              <w:t>Tiempo</w:t>
+            <w:shd w:val="clear" w:color="auto" w:fill="FFFFFF"/>
+            <w:tcMar>
+              <w:top w:w="50" w:type="dxa"/>
+              <w:left w:w="100" w:type="dxa"/>
+              <w:bottom w:w="50" w:type="dxa"/>
+              <w:right w:w="100" w:type="dxa"/>
+            </w:tcMar>
+            <w:vAlign w:val="center"/>
+          </w:tcPr>
+          <w:p>
+            <w:pPr>
+              <w:spacing w:line="260" w:lineRule="auto"/>
+            </w:pPr>
+            <w:r>
+              <w:rPr>
+                <w:sz w:val="19"/>
+                <w:szCs w:val="19"/>
+              </w:rPr>
+              <w:t xml:space="preserve">Tiempo</w:t>
             </w:r>
           </w:p>
         </w:tc>
         <w:tc>
           <w:tcPr>
             <w:tcW w:w="6420" w:type="dxa"/>
-            <w:shd w:val="clear" w:color="auto" w:fill="F2F2F2"/>
-            <w:tcMar>
-              <w:top w:w="50" w:type="dxa"/>
-              <w:left w:w="100" w:type="dxa"/>
-              <w:bottom w:w="50" w:type="dxa"/>
-              <w:right w:w="100" w:type="dxa"/>
-            </w:tcMar>
-            <w:vAlign w:val="center"/>
-          </w:tcPr>
-          <w:p>
-            <w:pPr>
-              <w:spacing w:line="260" w:lineRule="auto"/>
-            </w:pPr>
-            <w:r>
-              <w:rPr>
-                <w:sz w:val="19"/>
-                <w:szCs w:val="19"/>
-              </w:rPr>
-              <w:t>Concluir el proyecto en un máximo de 6 meses desde el acta de constitución, con una tolerancia de +10%.</w:t>
+            <w:shd w:val="clear" w:color="auto" w:fill="FFFFFF"/>
+            <w:tcMar>
+              <w:top w:w="50" w:type="dxa"/>
+              <w:left w:w="100" w:type="dxa"/>
+              <w:bottom w:w="50" w:type="dxa"/>
+              <w:right w:w="100" w:type="dxa"/>
+            </w:tcMar>
+            <w:vAlign w:val="center"/>
+          </w:tcPr>
+          <w:p>
+            <w:pPr>
+              <w:spacing w:line="260" w:lineRule="auto"/>
+            </w:pPr>
+            <w:r>
+              <w:rPr>
+                <w:sz w:val="19"/>
+                <w:szCs w:val="19"/>
+              </w:rPr>
+              <w:t xml:space="preserve">Concluir el proyecto entre el 15/09/2026 y el 15/01/2027 (4 meses), con una tolerancia de +10 %.</w:t>
             </w:r>
           </w:p>
         </w:tc>
@@ -952,7 +997,7 @@
                 <w:sz w:val="19"/>
                 <w:szCs w:val="19"/>
               </w:rPr>
-              <w:t>Costo</w:t>
+              <w:t xml:space="preserve">Costo</w:t>
             </w:r>
           </w:p>
         </w:tc>
@@ -977,7 +1022,7 @@
                 <w:sz w:val="19"/>
                 <w:szCs w:val="19"/>
               </w:rPr>
-              <w:t>No exceder el presupuesto aprobado, con una tolerancia máxima de +10%.</w:t>
+              <w:t xml:space="preserve">No exceder el presupuesto autorizado de S/ 42 200, con una tolerancia máxima de +10 %.</w:t>
             </w:r>
           </w:p>
         </w:tc>
@@ -992,50 +1037,50 @@
         <w:tc>
           <w:tcPr>
             <w:tcW w:w="2600" w:type="dxa"/>
-            <w:shd w:val="clear" w:color="auto" w:fill="F2F2F2"/>
-            <w:tcMar>
-              <w:top w:w="50" w:type="dxa"/>
-              <w:left w:w="100" w:type="dxa"/>
-              <w:bottom w:w="50" w:type="dxa"/>
-              <w:right w:w="100" w:type="dxa"/>
-            </w:tcMar>
-            <w:vAlign w:val="center"/>
-          </w:tcPr>
-          <w:p>
-            <w:pPr>
-              <w:spacing w:line="260" w:lineRule="auto"/>
-            </w:pPr>
-            <w:r>
-              <w:rPr>
-                <w:sz w:val="19"/>
-                <w:szCs w:val="19"/>
-              </w:rPr>
-              <w:t>Calidad</w:t>
+            <w:shd w:val="clear" w:color="auto" w:fill="FFFFFF"/>
+            <w:tcMar>
+              <w:top w:w="50" w:type="dxa"/>
+              <w:left w:w="100" w:type="dxa"/>
+              <w:bottom w:w="50" w:type="dxa"/>
+              <w:right w:w="100" w:type="dxa"/>
+            </w:tcMar>
+            <w:vAlign w:val="center"/>
+          </w:tcPr>
+          <w:p>
+            <w:pPr>
+              <w:spacing w:line="260" w:lineRule="auto"/>
+            </w:pPr>
+            <w:r>
+              <w:rPr>
+                <w:sz w:val="19"/>
+                <w:szCs w:val="19"/>
+              </w:rPr>
+              <w:t xml:space="preserve">Calidad</w:t>
             </w:r>
           </w:p>
         </w:tc>
         <w:tc>
           <w:tcPr>
             <w:tcW w:w="6420" w:type="dxa"/>
-            <w:shd w:val="clear" w:color="auto" w:fill="F2F2F2"/>
-            <w:tcMar>
-              <w:top w:w="50" w:type="dxa"/>
-              <w:left w:w="100" w:type="dxa"/>
-              <w:bottom w:w="50" w:type="dxa"/>
-              <w:right w:w="100" w:type="dxa"/>
-            </w:tcMar>
-            <w:vAlign w:val="center"/>
-          </w:tcPr>
-          <w:p>
-            <w:pPr>
-              <w:spacing w:line="260" w:lineRule="auto"/>
-            </w:pPr>
-            <w:r>
-              <w:rPr>
-                <w:sz w:val="19"/>
-                <w:szCs w:val="19"/>
-              </w:rPr>
-              <w:t xml:space="preserve">Alcanzar un índice de satisfacción del cliente ≥ 85% en la encuesta de salida y capacitar al 100% del personal de atención.</w:t>
+            <w:shd w:val="clear" w:color="auto" w:fill="FFFFFF"/>
+            <w:tcMar>
+              <w:top w:w="50" w:type="dxa"/>
+              <w:left w:w="100" w:type="dxa"/>
+              <w:bottom w:w="50" w:type="dxa"/>
+              <w:right w:w="100" w:type="dxa"/>
+            </w:tcMar>
+            <w:vAlign w:val="center"/>
+          </w:tcPr>
+          <w:p>
+            <w:pPr>
+              <w:spacing w:line="260" w:lineRule="auto"/>
+            </w:pPr>
+            <w:r>
+              <w:rPr>
+                <w:sz w:val="19"/>
+                <w:szCs w:val="19"/>
+              </w:rPr>
+              <w:t xml:space="preserve">Modelo con ROC-AUC ≥ 0,80 y recall ≥ 0,60; 100 % de atenciones sincronizadas sin duplicados; 0 incidentes críticos abiertos al cierre.</w:t>
             </w:r>
           </w:p>
         </w:tc>
@@ -1068,7 +1113,7 @@
                 <w:sz w:val="19"/>
                 <w:szCs w:val="19"/>
               </w:rPr>
-              <w:t>Adopción / Negocio</w:t>
+              <w:t xml:space="preserve">Adopción / Negocio</w:t>
             </w:r>
           </w:p>
         </w:tc>
@@ -1093,7 +1138,7 @@
                 <w:sz w:val="19"/>
                 <w:szCs w:val="19"/>
               </w:rPr>
-              <w:t xml:space="preserve">Afiliar al programa al menos al 60% de los clientes recurrentes en los primeros 3 meses y elevar la retención de clientes en al menos 15% al sexto mes.</w:t>
+              <w:t xml:space="preserve">100 % de las usuarias clave capacitadas (nota ≥ 80 %) y ≥ 90 % de las alertas de riesgo alto revisadas dentro de 48 horas durante la estabilización.</w:t>
             </w:r>
           </w:p>
         </w:tc>
@@ -1102,6 +1147,7 @@
     <w:p>
       <w:pPr>
         <w:pStyle w:val="Ttulo1"/>
+        <w:keepNext/>
         <w:pBdr>
           <w:bottom w:val="single" w:sz="8" w:space="4" w:color="1F4E79"/>
         </w:pBdr>
@@ -1129,7 +1175,7 @@
         <w:jc w:val="both"/>
       </w:pPr>
       <w:r>
-        <w:t xml:space="preserve">El programa debe contar con un registro único y estandarizado de la información de los clientes.</w:t>
+        <w:t xml:space="preserve">Usar el Excel del spa como única fuente de registro, sin obligar a registrar dos veces.</w:t>
       </w:r>
     </w:p>
     <w:p>
@@ -1143,7 +1189,7 @@
         <w:jc w:val="both"/>
       </w:pPr>
       <w:r>
-        <w:t xml:space="preserve">Debe definir reglas claras de acumulación y canje de beneficios según el monto o tipo de servicio consumido.</w:t>
+        <w:t xml:space="preserve">Calcular para cada cliente la probabilidad de abandono y su nivel de riesgo (bajo, medio, alto).</w:t>
       </w:r>
     </w:p>
     <w:p>
@@ -1157,7 +1203,7 @@
         <w:jc w:val="both"/>
       </w:pPr>
       <w:r>
-        <w:t xml:space="preserve">Debe permitir la segmentación de clientes para campañas y promociones dirigidas.</w:t>
+        <w:t xml:space="preserve">Mostrar dashboard, clientes, ficha 360° y alertas en un lenguaje comprensible para el personal.</w:t>
       </w:r>
     </w:p>
     <w:p>
@@ -1171,7 +1217,7 @@
         <w:jc w:val="both"/>
       </w:pPr>
       <w:r>
-        <w:t xml:space="preserve">Debe medir mensualmente indicadores de retención, frecuencia de visita y satisfacción.</w:t>
+        <w:t xml:space="preserve">Gestionar casos de retención con prioridad, motivo, acción sugerida y seguimiento.</w:t>
       </w:r>
     </w:p>
     <w:p>
@@ -1185,7 +1231,7 @@
         <w:jc w:val="both"/>
       </w:pPr>
       <w:r>
-        <w:t xml:space="preserve">Los protocolos de atención deben estar documentados y ser aplicados por todo el personal de atención.</w:t>
+        <w:t xml:space="preserve">Contactar por WhatsApp con mensaje editable y confirmación humana, nunca de forma masiva automática.</w:t>
       </w:r>
     </w:p>
     <w:p>
@@ -1199,7 +1245,7 @@
         <w:jc w:val="both"/>
       </w:pPr>
       <w:r>
-        <w:t xml:space="preserve">Debe cumplir con la Ley N.° 29733 de Protección de Datos Personales del Perú (consentimiento del cliente para el uso de sus datos).</w:t>
+        <w:t xml:space="preserve">Restringir el acceso por usuario y rol, con contraseñas propias y respaldo diario de la información.</w:t>
       </w:r>
     </w:p>
     <w:p>
@@ -1213,12 +1259,13 @@
         <w:jc w:val="both"/>
       </w:pPr>
       <w:r>
-        <w:t xml:space="preserve">El acceso a la información de los clientes debe restringirse al personal autorizado (administración, recepción y gerencia).</w:t>
+        <w:t xml:space="preserve">Cumplir con la Ley N.° 29733 de Protección de Datos Personales del Perú (consentimiento del cliente antes de habilitar el contacto).</w:t>
       </w:r>
     </w:p>
     <w:p>
       <w:pPr>
         <w:pStyle w:val="Ttulo1"/>
+        <w:keepNext/>
         <w:pBdr>
           <w:bottom w:val="single" w:sz="8" w:space="4" w:color="1F4E79"/>
         </w:pBdr>
@@ -1248,7 +1295,7 @@
         <w:t xml:space="preserve">Incluye: </w:t>
       </w:r>
       <w:r>
-        <w:t xml:space="preserve">diagnóstico, diseño del programa de fidelización, elaboración del manual de procesos, depuración del registro de clientes, material de comunicación, capacitación, lanzamiento, piloto y evaluación de resultados.</w:t>
+        <w:t xml:space="preserve">levantamiento de requisitos y diseño de la solución; preparación de datos, entrenamiento y validación del modelo; desarrollo del backend, la sincronización con Excel y la aplicación web; Centro de Retención y contacto por WhatsApp; pruebas; instalación local y respaldo; capacitación por rol, manuales, estabilización asistida, transición a la operación y cierre formal.</w:t>
       </w:r>
     </w:p>
     <w:p>
@@ -1264,12 +1311,13 @@
         <w:t xml:space="preserve">No incluye (exclusiones): </w:t>
       </w:r>
       <w:r>
-        <w:t xml:space="preserve">desarrollo o adquisición de software a la medida (CRM o aplicación móvil), remodelación de infraestructura, contratación de personal permanente y cambios en la carta de servicios, salvo aprobación expresa mediante control de cambios.</w:t>
+        <w:t xml:space="preserve">envío automático con la API oficial de WhatsApp Business; reservas, pagos en línea, facturación electrónica o integración con POS; despliegue en la nube o aplicación móvil nativa; reentrenamiento automático del modelo en producción; contratación de personal permanente y cambios al proceso de atención no ligados al CRM, salvo aprobación expresa mediante control de cambios.</w:t>
       </w:r>
     </w:p>
     <w:p>
       <w:pPr>
         <w:pStyle w:val="Ttulo1"/>
+        <w:keepNext/>
         <w:pBdr>
           <w:bottom w:val="single" w:sz="8" w:space="4" w:color="1F4E79"/>
         </w:pBdr>
@@ -1310,8 +1358,7 @@
         <w:jc w:val="both"/>
       </w:pPr>
       <w:r>
-        <w:lastRenderedPageBreak/>
-        <w:t xml:space="preserve">La gerencia de Essenza SPA brindará la información y disponibilidad del personal clave para las reuniones y validaciones.</w:t>
+        <w:t xml:space="preserve">El Excel seguirá siendo la herramienta de registro diario de las atenciones.</w:t>
       </w:r>
     </w:p>
     <w:p>
@@ -1325,7 +1372,7 @@
         <w:jc w:val="both"/>
       </w:pPr>
       <w:r>
-        <w:t xml:space="preserve">La información de clientes existente (registros y hojas de cálculo) está disponible para su depuración.</w:t>
+        <w:t xml:space="preserve">El historial de atenciones del spa está disponible para depurarlo y entrenar el modelo.</w:t>
       </w:r>
     </w:p>
     <w:p>
@@ -1339,20 +1386,7 @@
         <w:jc w:val="both"/>
       </w:pPr>
       <w:r>
-        <w:t>El presupuesto y los recursos aprobados se mantendrán durante la ejecución del proyecto.</w:t>
-      </w:r>
-    </w:p>
-    <w:p>
-      <w:pPr>
-        <w:spacing w:after="60" w:line="276" w:lineRule="auto"/>
-        <w:jc w:val="both"/>
-      </w:pPr>
-      <w:r>
-        <w:rPr>
-          <w:b/>
-          <w:bCs/>
-        </w:rPr>
-        <w:t>Restricciones:</w:t>
+        <w:t xml:space="preserve">El spa dispone de una PC con Windows en recepción para instalar el CRM.</w:t>
       </w:r>
     </w:p>
     <w:p>
@@ -1366,7 +1400,20 @@
         <w:jc w:val="both"/>
       </w:pPr>
       <w:r>
-        <w:t>Plazo máximo de ejecución: 6 meses.</w:t>
+        <w:t xml:space="preserve">La dueña y la administradora participarán en las revisiones, validaciones y en la aceptación.</w:t>
+      </w:r>
+    </w:p>
+    <w:p>
+      <w:pPr>
+        <w:spacing w:after="60" w:line="276" w:lineRule="auto"/>
+        <w:jc w:val="both"/>
+      </w:pPr>
+      <w:r>
+        <w:rPr>
+          <w:b/>
+          <w:bCs/>
+        </w:rPr>
+        <w:t>Restricciones:</w:t>
       </w:r>
     </w:p>
     <w:p>
@@ -1380,7 +1427,7 @@
         <w:jc w:val="both"/>
       </w:pPr>
       <w:r>
-        <w:t>Presupuesto fijo aprobado por la gerencia.</w:t>
+        <w:t xml:space="preserve">Plazo: del 15 de septiembre de 2026 al 15 de enero de 2027 (4 meses).</w:t>
       </w:r>
     </w:p>
     <w:p>
@@ -1394,7 +1441,7 @@
         <w:jc w:val="both"/>
       </w:pPr>
       <w:r>
-        <w:t xml:space="preserve">El proyecto no contempla el desarrollo de software; se trabajará con los recursos y herramientas que la empresa ya posee, cumpliendo la normativa de protección de datos vigente.</w:t>
+        <w:t xml:space="preserve">Presupuesto autorizado de S/ 42 200, con una tolerancia de +10 %.</w:t>
       </w:r>
     </w:p>
     <w:p>
@@ -1408,12 +1455,27 @@
         <w:jc w:val="both"/>
       </w:pPr>
       <w:r>
-        <w:t>El equipo de proyecto es reducido y con dedicación parcial.</w:t>
+        <w:t xml:space="preserve">Operación local en la PC del spa, sin servidores en la nube, cumpliendo la normativa de protección de datos vigente.</w:t>
+      </w:r>
+    </w:p>
+    <w:p>
+      <w:pPr>
+        <w:pStyle w:val="Prrafodelista"/>
+        <w:numPr>
+          <w:ilvl w:val="0"/>
+          <w:numId w:val="2"/>
+        </w:numPr>
+        <w:spacing w:after="60" w:line="276" w:lineRule="auto"/>
+        <w:jc w:val="both"/>
+      </w:pPr>
+      <w:r>
+        <w:t xml:space="preserve">Equipo reducido y con dedicación parcial; las pruebas y la puesta en marcha no deben interrumpir la atención al público.</w:t>
       </w:r>
     </w:p>
     <w:p>
       <w:pPr>
         <w:pStyle w:val="Ttulo1"/>
+        <w:keepNext/>
         <w:pBdr>
           <w:bottom w:val="single" w:sz="8" w:space="4" w:color="1F4E79"/>
         </w:pBdr>
@@ -1572,7 +1634,7 @@
                 <w:sz w:val="19"/>
                 <w:szCs w:val="19"/>
               </w:rPr>
-              <w:t xml:space="preserve">Baja adhesión de los clientes al programa de membresía</w:t>
+              <w:t xml:space="preserve">Datos del registro incompletos o de baja calidad</w:t>
             </w:r>
           </w:p>
         </w:tc>
@@ -1597,7 +1659,7 @@
                 <w:sz w:val="19"/>
                 <w:szCs w:val="19"/>
               </w:rPr>
-              <w:t>Alto</w:t>
+              <w:t xml:space="preserve">Alto</w:t>
             </w:r>
           </w:p>
         </w:tc>
@@ -1622,7 +1684,7 @@
                 <w:sz w:val="19"/>
                 <w:szCs w:val="19"/>
               </w:rPr>
-              <w:t xml:space="preserve">Beneficios atractivos desde el primer nivel y campaña de lanzamiento.</w:t>
+              <w:t xml:space="preserve">Depuración y validación temprana del Excel con reglas de calidad de datos.</w:t>
             </w:r>
           </w:p>
         </w:tc>
@@ -1637,75 +1699,75 @@
         <w:tc>
           <w:tcPr>
             <w:tcW w:w="4400" w:type="dxa"/>
-            <w:shd w:val="clear" w:color="auto" w:fill="F2F2F2"/>
-            <w:tcMar>
-              <w:top w:w="50" w:type="dxa"/>
-              <w:left w:w="100" w:type="dxa"/>
-              <w:bottom w:w="50" w:type="dxa"/>
-              <w:right w:w="100" w:type="dxa"/>
-            </w:tcMar>
-            <w:vAlign w:val="center"/>
-          </w:tcPr>
-          <w:p>
-            <w:pPr>
-              <w:spacing w:line="260" w:lineRule="auto"/>
-            </w:pPr>
-            <w:r>
-              <w:rPr>
-                <w:sz w:val="19"/>
-                <w:szCs w:val="19"/>
-              </w:rPr>
-              <w:t xml:space="preserve">Información de clientes incompleta o desactualizada</w:t>
+            <w:shd w:val="clear" w:color="auto" w:fill="FFFFFF"/>
+            <w:tcMar>
+              <w:top w:w="50" w:type="dxa"/>
+              <w:left w:w="100" w:type="dxa"/>
+              <w:bottom w:w="50" w:type="dxa"/>
+              <w:right w:w="100" w:type="dxa"/>
+            </w:tcMar>
+            <w:vAlign w:val="center"/>
+          </w:tcPr>
+          <w:p>
+            <w:pPr>
+              <w:spacing w:line="260" w:lineRule="auto"/>
+            </w:pPr>
+            <w:r>
+              <w:rPr>
+                <w:sz w:val="19"/>
+                <w:szCs w:val="19"/>
+              </w:rPr>
+              <w:t xml:space="preserve">El modelo no alcanza la meta (ROC-AUC ≥ 0,80 y recall ≥ 0,60)</w:t>
             </w:r>
           </w:p>
         </w:tc>
         <w:tc>
           <w:tcPr>
             <w:tcW w:w="1300" w:type="dxa"/>
-            <w:shd w:val="clear" w:color="auto" w:fill="F2F2F2"/>
-            <w:tcMar>
-              <w:top w:w="50" w:type="dxa"/>
-              <w:left w:w="100" w:type="dxa"/>
-              <w:bottom w:w="50" w:type="dxa"/>
-              <w:right w:w="100" w:type="dxa"/>
-            </w:tcMar>
-            <w:vAlign w:val="center"/>
-          </w:tcPr>
-          <w:p>
-            <w:pPr>
-              <w:spacing w:line="260" w:lineRule="auto"/>
-            </w:pPr>
-            <w:r>
-              <w:rPr>
-                <w:sz w:val="19"/>
-                <w:szCs w:val="19"/>
-              </w:rPr>
-              <w:t>Medio</w:t>
+            <w:shd w:val="clear" w:color="auto" w:fill="FFFFFF"/>
+            <w:tcMar>
+              <w:top w:w="50" w:type="dxa"/>
+              <w:left w:w="100" w:type="dxa"/>
+              <w:bottom w:w="50" w:type="dxa"/>
+              <w:right w:w="100" w:type="dxa"/>
+            </w:tcMar>
+            <w:vAlign w:val="center"/>
+          </w:tcPr>
+          <w:p>
+            <w:pPr>
+              <w:spacing w:line="260" w:lineRule="auto"/>
+            </w:pPr>
+            <w:r>
+              <w:rPr>
+                <w:sz w:val="19"/>
+                <w:szCs w:val="19"/>
+              </w:rPr>
+              <w:t xml:space="preserve">Alto</w:t>
             </w:r>
           </w:p>
         </w:tc>
         <w:tc>
           <w:tcPr>
             <w:tcW w:w="3320" w:type="dxa"/>
-            <w:shd w:val="clear" w:color="auto" w:fill="F2F2F2"/>
-            <w:tcMar>
-              <w:top w:w="50" w:type="dxa"/>
-              <w:left w:w="100" w:type="dxa"/>
-              <w:bottom w:w="50" w:type="dxa"/>
-              <w:right w:w="100" w:type="dxa"/>
-            </w:tcMar>
-            <w:vAlign w:val="center"/>
-          </w:tcPr>
-          <w:p>
-            <w:pPr>
-              <w:spacing w:line="260" w:lineRule="auto"/>
-            </w:pPr>
-            <w:r>
-              <w:rPr>
-                <w:sz w:val="19"/>
-                <w:szCs w:val="19"/>
-              </w:rPr>
-              <w:t xml:space="preserve">Actualizar los datos del cliente en cada visita durante el piloto.</w:t>
+            <w:shd w:val="clear" w:color="auto" w:fill="FFFFFF"/>
+            <w:tcMar>
+              <w:top w:w="50" w:type="dxa"/>
+              <w:left w:w="100" w:type="dxa"/>
+              <w:bottom w:w="50" w:type="dxa"/>
+              <w:right w:w="100" w:type="dxa"/>
+            </w:tcMar>
+            <w:vAlign w:val="center"/>
+          </w:tcPr>
+          <w:p>
+            <w:pPr>
+              <w:spacing w:line="260" w:lineRule="auto"/>
+            </w:pPr>
+            <w:r>
+              <w:rPr>
+                <w:sz w:val="19"/>
+                <w:szCs w:val="19"/>
+              </w:rPr>
+              <w:t xml:space="preserve">Ajuste de variables e hiperparámetros y un modelo base de respaldo.</w:t>
             </w:r>
           </w:p>
         </w:tc>
@@ -1738,7 +1800,7 @@
                 <w:sz w:val="19"/>
                 <w:szCs w:val="19"/>
               </w:rPr>
-              <w:t xml:space="preserve">Resistencia del personal a los nuevos protocolos de atención</w:t>
+              <w:t xml:space="preserve">Retraso en la integración con el Excel del spa</w:t>
             </w:r>
           </w:p>
         </w:tc>
@@ -1763,7 +1825,7 @@
                 <w:sz w:val="19"/>
                 <w:szCs w:val="19"/>
               </w:rPr>
-              <w:t>Medio</w:t>
+              <w:t xml:space="preserve">Medio</w:t>
             </w:r>
           </w:p>
         </w:tc>
@@ -1788,7 +1850,7 @@
                 <w:sz w:val="19"/>
                 <w:szCs w:val="19"/>
               </w:rPr>
-              <w:t>Capacitación temprana y acompañamiento en la puesta en marcha.</w:t>
+              <w:t xml:space="preserve">Prototipo temprano de la sincronización y control de cambios por hash.</w:t>
             </w:r>
           </w:p>
         </w:tc>
@@ -1803,75 +1865,75 @@
         <w:tc>
           <w:tcPr>
             <w:tcW w:w="4400" w:type="dxa"/>
-            <w:shd w:val="clear" w:color="auto" w:fill="F2F2F2"/>
-            <w:tcMar>
-              <w:top w:w="50" w:type="dxa"/>
-              <w:left w:w="100" w:type="dxa"/>
-              <w:bottom w:w="50" w:type="dxa"/>
-              <w:right w:w="100" w:type="dxa"/>
-            </w:tcMar>
-            <w:vAlign w:val="center"/>
-          </w:tcPr>
-          <w:p>
-            <w:pPr>
-              <w:spacing w:line="260" w:lineRule="auto"/>
-            </w:pPr>
-            <w:r>
-              <w:rPr>
-                <w:sz w:val="19"/>
-                <w:szCs w:val="19"/>
-              </w:rPr>
-              <w:t>Retrasos por disponibilidad parcial del equipo</w:t>
+            <w:shd w:val="clear" w:color="auto" w:fill="FFFFFF"/>
+            <w:tcMar>
+              <w:top w:w="50" w:type="dxa"/>
+              <w:left w:w="100" w:type="dxa"/>
+              <w:bottom w:w="50" w:type="dxa"/>
+              <w:right w:w="100" w:type="dxa"/>
+            </w:tcMar>
+            <w:vAlign w:val="center"/>
+          </w:tcPr>
+          <w:p>
+            <w:pPr>
+              <w:spacing w:line="260" w:lineRule="auto"/>
+            </w:pPr>
+            <w:r>
+              <w:rPr>
+                <w:sz w:val="19"/>
+                <w:szCs w:val="19"/>
+              </w:rPr>
+              <w:t xml:space="preserve">Baja adopción del CRM por el personal</w:t>
             </w:r>
           </w:p>
         </w:tc>
         <w:tc>
           <w:tcPr>
             <w:tcW w:w="1300" w:type="dxa"/>
-            <w:shd w:val="clear" w:color="auto" w:fill="F2F2F2"/>
-            <w:tcMar>
-              <w:top w:w="50" w:type="dxa"/>
-              <w:left w:w="100" w:type="dxa"/>
-              <w:bottom w:w="50" w:type="dxa"/>
-              <w:right w:w="100" w:type="dxa"/>
-            </w:tcMar>
-            <w:vAlign w:val="center"/>
-          </w:tcPr>
-          <w:p>
-            <w:pPr>
-              <w:spacing w:line="260" w:lineRule="auto"/>
-            </w:pPr>
-            <w:r>
-              <w:rPr>
-                <w:sz w:val="19"/>
-                <w:szCs w:val="19"/>
-              </w:rPr>
-              <w:t>Medio</w:t>
+            <w:shd w:val="clear" w:color="auto" w:fill="FFFFFF"/>
+            <w:tcMar>
+              <w:top w:w="50" w:type="dxa"/>
+              <w:left w:w="100" w:type="dxa"/>
+              <w:bottom w:w="50" w:type="dxa"/>
+              <w:right w:w="100" w:type="dxa"/>
+            </w:tcMar>
+            <w:vAlign w:val="center"/>
+          </w:tcPr>
+          <w:p>
+            <w:pPr>
+              <w:spacing w:line="260" w:lineRule="auto"/>
+            </w:pPr>
+            <w:r>
+              <w:rPr>
+                <w:sz w:val="19"/>
+                <w:szCs w:val="19"/>
+              </w:rPr>
+              <w:t xml:space="preserve">Alto</w:t>
             </w:r>
           </w:p>
         </w:tc>
         <w:tc>
           <w:tcPr>
             <w:tcW w:w="3320" w:type="dxa"/>
-            <w:shd w:val="clear" w:color="auto" w:fill="F2F2F2"/>
-            <w:tcMar>
-              <w:top w:w="50" w:type="dxa"/>
-              <w:left w:w="100" w:type="dxa"/>
-              <w:bottom w:w="50" w:type="dxa"/>
-              <w:right w:w="100" w:type="dxa"/>
-            </w:tcMar>
-            <w:vAlign w:val="center"/>
-          </w:tcPr>
-          <w:p>
-            <w:pPr>
-              <w:spacing w:line="260" w:lineRule="auto"/>
-            </w:pPr>
-            <w:r>
-              <w:rPr>
-                <w:sz w:val="19"/>
-                <w:szCs w:val="19"/>
-              </w:rPr>
-              <w:t xml:space="preserve">Planificación realista de plazos y priorización de entregables.</w:t>
+            <w:shd w:val="clear" w:color="auto" w:fill="FFFFFF"/>
+            <w:tcMar>
+              <w:top w:w="50" w:type="dxa"/>
+              <w:left w:w="100" w:type="dxa"/>
+              <w:bottom w:w="50" w:type="dxa"/>
+              <w:right w:w="100" w:type="dxa"/>
+            </w:tcMar>
+            <w:vAlign w:val="center"/>
+          </w:tcPr>
+          <w:p>
+            <w:pPr>
+              <w:spacing w:line="260" w:lineRule="auto"/>
+            </w:pPr>
+            <w:r>
+              <w:rPr>
+                <w:sz w:val="19"/>
+                <w:szCs w:val="19"/>
+              </w:rPr>
+              <w:t xml:space="preserve">Usuarias en el diseño, capacitación por rol y estabilización asistida.</w:t>
             </w:r>
           </w:p>
         </w:tc>
@@ -1904,7 +1966,7 @@
                 <w:sz w:val="19"/>
                 <w:szCs w:val="19"/>
               </w:rPr>
-              <w:t xml:space="preserve">Costo de los beneficios que reduzca el margen del negocio</w:t>
+              <w:t xml:space="preserve">Falla de la PC o pérdida de datos durante la puesta en marcha</w:t>
             </w:r>
           </w:p>
         </w:tc>
@@ -1929,7 +1991,7 @@
                 <w:sz w:val="19"/>
                 <w:szCs w:val="19"/>
               </w:rPr>
-              <w:t>Alto</w:t>
+              <w:t xml:space="preserve">Medio</w:t>
             </w:r>
           </w:p>
         </w:tc>
@@ -1954,7 +2016,7 @@
                 <w:sz w:val="19"/>
                 <w:szCs w:val="19"/>
               </w:rPr>
-              <w:t xml:space="preserve">Definir tope de beneficios y revisar su rentabilidad mensualmente.</w:t>
+              <w:t xml:space="preserve">UPS, respaldo diario en disco externo y prueba de restauración.</w:t>
             </w:r>
           </w:p>
         </w:tc>
@@ -1963,6 +2025,7 @@
     <w:p>
       <w:pPr>
         <w:pStyle w:val="Ttulo1"/>
+        <w:keepNext/>
         <w:pBdr>
           <w:bottom w:val="single" w:sz="8" w:space="4" w:color="1F4E79"/>
         </w:pBdr>
@@ -2121,7 +2184,7 @@
                 <w:sz w:val="19"/>
                 <w:szCs w:val="19"/>
               </w:rPr>
-              <w:t>Inicio del proyecto</w:t>
+              <w:t xml:space="preserve">H0 · Inicio del proyecto</w:t>
             </w:r>
           </w:p>
         </w:tc>
@@ -2146,7 +2209,7 @@
                 <w:sz w:val="19"/>
                 <w:szCs w:val="19"/>
               </w:rPr>
-              <w:t>Acta de constitución aprobada</w:t>
+              <w:t xml:space="preserve">Acta aprobada y reunión de lanzamiento</w:t>
             </w:r>
           </w:p>
         </w:tc>
@@ -2171,7 +2234,7 @@
                 <w:sz w:val="19"/>
                 <w:szCs w:val="19"/>
               </w:rPr>
-              <w:t>Mes 1</w:t>
+              <w:t xml:space="preserve">17/09/2026</w:t>
             </w:r>
           </w:p>
         </w:tc>
@@ -2186,75 +2249,75 @@
         <w:tc>
           <w:tcPr>
             <w:tcW w:w="3200" w:type="dxa"/>
-            <w:shd w:val="clear" w:color="auto" w:fill="F2F2F2"/>
-            <w:tcMar>
-              <w:top w:w="50" w:type="dxa"/>
-              <w:left w:w="100" w:type="dxa"/>
-              <w:bottom w:w="50" w:type="dxa"/>
-              <w:right w:w="100" w:type="dxa"/>
-            </w:tcMar>
-            <w:vAlign w:val="center"/>
-          </w:tcPr>
-          <w:p>
-            <w:pPr>
-              <w:spacing w:line="260" w:lineRule="auto"/>
-            </w:pPr>
-            <w:r>
-              <w:rPr>
-                <w:sz w:val="19"/>
-                <w:szCs w:val="19"/>
-              </w:rPr>
-              <w:t xml:space="preserve">Diagnóstico concluido</w:t>
+            <w:shd w:val="clear" w:color="auto" w:fill="FFFFFF"/>
+            <w:tcMar>
+              <w:top w:w="50" w:type="dxa"/>
+              <w:left w:w="100" w:type="dxa"/>
+              <w:bottom w:w="50" w:type="dxa"/>
+              <w:right w:w="100" w:type="dxa"/>
+            </w:tcMar>
+            <w:vAlign w:val="center"/>
+          </w:tcPr>
+          <w:p>
+            <w:pPr>
+              <w:spacing w:line="260" w:lineRule="auto"/>
+            </w:pPr>
+            <w:r>
+              <w:rPr>
+                <w:sz w:val="19"/>
+                <w:szCs w:val="19"/>
+              </w:rPr>
+              <w:t xml:space="preserve">H1 · Requisitos y diseño aprobados</w:t>
             </w:r>
           </w:p>
         </w:tc>
         <w:tc>
           <w:tcPr>
             <w:tcW w:w="4020" w:type="dxa"/>
-            <w:shd w:val="clear" w:color="auto" w:fill="F2F2F2"/>
-            <w:tcMar>
-              <w:top w:w="50" w:type="dxa"/>
-              <w:left w:w="100" w:type="dxa"/>
-              <w:bottom w:w="50" w:type="dxa"/>
-              <w:right w:w="100" w:type="dxa"/>
-            </w:tcMar>
-            <w:vAlign w:val="center"/>
-          </w:tcPr>
-          <w:p>
-            <w:pPr>
-              <w:spacing w:line="260" w:lineRule="auto"/>
-            </w:pPr>
-            <w:r>
-              <w:rPr>
-                <w:sz w:val="19"/>
-                <w:szCs w:val="19"/>
-              </w:rPr>
-              <w:t xml:space="preserve">Informe de diagnóstico y encuesta de satisfacción</w:t>
+            <w:shd w:val="clear" w:color="auto" w:fill="FFFFFF"/>
+            <w:tcMar>
+              <w:top w:w="50" w:type="dxa"/>
+              <w:left w:w="100" w:type="dxa"/>
+              <w:bottom w:w="50" w:type="dxa"/>
+              <w:right w:w="100" w:type="dxa"/>
+            </w:tcMar>
+            <w:vAlign w:val="center"/>
+          </w:tcPr>
+          <w:p>
+            <w:pPr>
+              <w:spacing w:line="260" w:lineRule="auto"/>
+            </w:pPr>
+            <w:r>
+              <w:rPr>
+                <w:sz w:val="19"/>
+                <w:szCs w:val="19"/>
+              </w:rPr>
+              <w:t xml:space="preserve">Requisitos priorizados, arquitectura y prototipo</w:t>
             </w:r>
           </w:p>
         </w:tc>
         <w:tc>
           <w:tcPr>
             <w:tcW w:w="1800" w:type="dxa"/>
-            <w:shd w:val="clear" w:color="auto" w:fill="F2F2F2"/>
-            <w:tcMar>
-              <w:top w:w="50" w:type="dxa"/>
-              <w:left w:w="100" w:type="dxa"/>
-              <w:bottom w:w="50" w:type="dxa"/>
-              <w:right w:w="100" w:type="dxa"/>
-            </w:tcMar>
-            <w:vAlign w:val="center"/>
-          </w:tcPr>
-          <w:p>
-            <w:pPr>
-              <w:spacing w:line="260" w:lineRule="auto"/>
-            </w:pPr>
-            <w:r>
-              <w:rPr>
-                <w:sz w:val="19"/>
-                <w:szCs w:val="19"/>
-              </w:rPr>
-              <w:t>Mes 2</w:t>
+            <w:shd w:val="clear" w:color="auto" w:fill="FFFFFF"/>
+            <w:tcMar>
+              <w:top w:w="50" w:type="dxa"/>
+              <w:left w:w="100" w:type="dxa"/>
+              <w:bottom w:w="50" w:type="dxa"/>
+              <w:right w:w="100" w:type="dxa"/>
+            </w:tcMar>
+            <w:vAlign w:val="center"/>
+          </w:tcPr>
+          <w:p>
+            <w:pPr>
+              <w:spacing w:line="260" w:lineRule="auto"/>
+            </w:pPr>
+            <w:r>
+              <w:rPr>
+                <w:sz w:val="19"/>
+                <w:szCs w:val="19"/>
+              </w:rPr>
+              <w:t xml:space="preserve">05/10/2026</w:t>
             </w:r>
           </w:p>
         </w:tc>
@@ -2287,7 +2350,7 @@
                 <w:sz w:val="19"/>
                 <w:szCs w:val="19"/>
               </w:rPr>
-              <w:t xml:space="preserve">Diseño del programa y procesos</w:t>
+              <w:t xml:space="preserve">H2 · Modelo predictivo validado</w:t>
             </w:r>
           </w:p>
         </w:tc>
@@ -2312,7 +2375,7 @@
                 <w:sz w:val="19"/>
                 <w:szCs w:val="19"/>
               </w:rPr>
-              <w:t xml:space="preserve">Programa de membresía y manual de procesos</w:t>
+              <w:t xml:space="preserve">Modelo con métricas dentro de la meta</w:t>
             </w:r>
           </w:p>
         </w:tc>
@@ -2337,7 +2400,7 @@
                 <w:sz w:val="19"/>
                 <w:szCs w:val="19"/>
               </w:rPr>
-              <w:t>Mes 4</w:t>
+              <w:t xml:space="preserve">06/11/2026</w:t>
             </w:r>
           </w:p>
         </w:tc>
@@ -2352,75 +2415,75 @@
         <w:tc>
           <w:tcPr>
             <w:tcW w:w="3200" w:type="dxa"/>
-            <w:shd w:val="clear" w:color="auto" w:fill="F2F2F2"/>
-            <w:tcMar>
-              <w:top w:w="50" w:type="dxa"/>
-              <w:left w:w="100" w:type="dxa"/>
-              <w:bottom w:w="50" w:type="dxa"/>
-              <w:right w:w="100" w:type="dxa"/>
-            </w:tcMar>
-            <w:vAlign w:val="center"/>
-          </w:tcPr>
-          <w:p>
-            <w:pPr>
-              <w:spacing w:line="260" w:lineRule="auto"/>
-            </w:pPr>
-            <w:r>
-              <w:rPr>
-                <w:sz w:val="19"/>
-                <w:szCs w:val="19"/>
-              </w:rPr>
-              <w:t xml:space="preserve">Capacitación y lanzamiento piloto</w:t>
+            <w:shd w:val="clear" w:color="auto" w:fill="FFFFFF"/>
+            <w:tcMar>
+              <w:top w:w="50" w:type="dxa"/>
+              <w:left w:w="100" w:type="dxa"/>
+              <w:bottom w:w="50" w:type="dxa"/>
+              <w:right w:w="100" w:type="dxa"/>
+            </w:tcMar>
+            <w:vAlign w:val="center"/>
+          </w:tcPr>
+          <w:p>
+            <w:pPr>
+              <w:spacing w:line="260" w:lineRule="auto"/>
+            </w:pPr>
+            <w:r>
+              <w:rPr>
+                <w:sz w:val="19"/>
+                <w:szCs w:val="19"/>
+              </w:rPr>
+              <w:t xml:space="preserve">H3 · Sistema integrado</w:t>
             </w:r>
           </w:p>
         </w:tc>
         <w:tc>
           <w:tcPr>
             <w:tcW w:w="4020" w:type="dxa"/>
-            <w:shd w:val="clear" w:color="auto" w:fill="F2F2F2"/>
-            <w:tcMar>
-              <w:top w:w="50" w:type="dxa"/>
-              <w:left w:w="100" w:type="dxa"/>
-              <w:bottom w:w="50" w:type="dxa"/>
-              <w:right w:w="100" w:type="dxa"/>
-            </w:tcMar>
-            <w:vAlign w:val="center"/>
-          </w:tcPr>
-          <w:p>
-            <w:pPr>
-              <w:spacing w:line="260" w:lineRule="auto"/>
-            </w:pPr>
-            <w:r>
-              <w:rPr>
-                <w:sz w:val="19"/>
-                <w:szCs w:val="19"/>
-              </w:rPr>
-              <w:t xml:space="preserve">Personal capacitado y programa en marcha</w:t>
+            <w:shd w:val="clear" w:color="auto" w:fill="FFFFFF"/>
+            <w:tcMar>
+              <w:top w:w="50" w:type="dxa"/>
+              <w:left w:w="100" w:type="dxa"/>
+              <w:bottom w:w="50" w:type="dxa"/>
+              <w:right w:w="100" w:type="dxa"/>
+            </w:tcMar>
+            <w:vAlign w:val="center"/>
+          </w:tcPr>
+          <w:p>
+            <w:pPr>
+              <w:spacing w:line="260" w:lineRule="auto"/>
+            </w:pPr>
+            <w:r>
+              <w:rPr>
+                <w:sz w:val="19"/>
+                <w:szCs w:val="19"/>
+              </w:rPr>
+              <w:t xml:space="preserve">CRM completo listo para las pruebas integrales</w:t>
             </w:r>
           </w:p>
         </w:tc>
         <w:tc>
           <w:tcPr>
             <w:tcW w:w="1800" w:type="dxa"/>
-            <w:shd w:val="clear" w:color="auto" w:fill="F2F2F2"/>
-            <w:tcMar>
-              <w:top w:w="50" w:type="dxa"/>
-              <w:left w:w="100" w:type="dxa"/>
-              <w:bottom w:w="50" w:type="dxa"/>
-              <w:right w:w="100" w:type="dxa"/>
-            </w:tcMar>
-            <w:vAlign w:val="center"/>
-          </w:tcPr>
-          <w:p>
-            <w:pPr>
-              <w:spacing w:line="260" w:lineRule="auto"/>
-            </w:pPr>
-            <w:r>
-              <w:rPr>
-                <w:sz w:val="19"/>
-                <w:szCs w:val="19"/>
-              </w:rPr>
-              <w:t>Mes 5</w:t>
+            <w:shd w:val="clear" w:color="auto" w:fill="FFFFFF"/>
+            <w:tcMar>
+              <w:top w:w="50" w:type="dxa"/>
+              <w:left w:w="100" w:type="dxa"/>
+              <w:bottom w:w="50" w:type="dxa"/>
+              <w:right w:w="100" w:type="dxa"/>
+            </w:tcMar>
+            <w:vAlign w:val="center"/>
+          </w:tcPr>
+          <w:p>
+            <w:pPr>
+              <w:spacing w:line="260" w:lineRule="auto"/>
+            </w:pPr>
+            <w:r>
+              <w:rPr>
+                <w:sz w:val="19"/>
+                <w:szCs w:val="19"/>
+              </w:rPr>
+              <w:t xml:space="preserve">03/12/2026</w:t>
             </w:r>
           </w:p>
         </w:tc>
@@ -2453,7 +2516,7 @@
                 <w:sz w:val="19"/>
                 <w:szCs w:val="19"/>
               </w:rPr>
-              <w:t xml:space="preserve">Evaluación de resultados</w:t>
+              <w:t xml:space="preserve">H4 · Puesta en producción (go-live)</w:t>
             </w:r>
           </w:p>
         </w:tc>
@@ -2478,7 +2541,7 @@
                 <w:sz w:val="19"/>
                 <w:szCs w:val="19"/>
               </w:rPr>
-              <w:t xml:space="preserve">Informe de indicadores y ajustes al programa</w:t>
+              <w:t xml:space="preserve">CRM instalado en el spa y usuarias capacitadas</w:t>
             </w:r>
           </w:p>
         </w:tc>
@@ -2503,7 +2566,7 @@
                 <w:sz w:val="19"/>
                 <w:szCs w:val="19"/>
               </w:rPr>
-              <w:t>Mes 6</w:t>
+              <w:t xml:space="preserve">24/12/2026</w:t>
             </w:r>
           </w:p>
         </w:tc>
@@ -2518,75 +2581,75 @@
         <w:tc>
           <w:tcPr>
             <w:tcW w:w="3200" w:type="dxa"/>
-            <w:shd w:val="clear" w:color="auto" w:fill="F2F2F2"/>
-            <w:tcMar>
-              <w:top w:w="50" w:type="dxa"/>
-              <w:left w:w="100" w:type="dxa"/>
-              <w:bottom w:w="50" w:type="dxa"/>
-              <w:right w:w="100" w:type="dxa"/>
-            </w:tcMar>
-            <w:vAlign w:val="center"/>
-          </w:tcPr>
-          <w:p>
-            <w:pPr>
-              <w:spacing w:line="260" w:lineRule="auto"/>
-            </w:pPr>
-            <w:r>
-              <w:rPr>
-                <w:sz w:val="19"/>
-                <w:szCs w:val="19"/>
-              </w:rPr>
-              <w:t>Cierre del proyecto</w:t>
+            <w:shd w:val="clear" w:color="auto" w:fill="FFFFFF"/>
+            <w:tcMar>
+              <w:top w:w="50" w:type="dxa"/>
+              <w:left w:w="100" w:type="dxa"/>
+              <w:bottom w:w="50" w:type="dxa"/>
+              <w:right w:w="100" w:type="dxa"/>
+            </w:tcMar>
+            <w:vAlign w:val="center"/>
+          </w:tcPr>
+          <w:p>
+            <w:pPr>
+              <w:spacing w:line="260" w:lineRule="auto"/>
+            </w:pPr>
+            <w:r>
+              <w:rPr>
+                <w:sz w:val="19"/>
+                <w:szCs w:val="19"/>
+              </w:rPr>
+              <w:t xml:space="preserve">H5 · Aceptación y cierre del proyecto</w:t>
             </w:r>
           </w:p>
         </w:tc>
         <w:tc>
           <w:tcPr>
             <w:tcW w:w="4020" w:type="dxa"/>
-            <w:shd w:val="clear" w:color="auto" w:fill="F2F2F2"/>
-            <w:tcMar>
-              <w:top w:w="50" w:type="dxa"/>
-              <w:left w:w="100" w:type="dxa"/>
-              <w:bottom w:w="50" w:type="dxa"/>
-              <w:right w:w="100" w:type="dxa"/>
-            </w:tcMar>
-            <w:vAlign w:val="center"/>
-          </w:tcPr>
-          <w:p>
-            <w:pPr>
-              <w:spacing w:line="260" w:lineRule="auto"/>
-            </w:pPr>
-            <w:r>
-              <w:rPr>
-                <w:sz w:val="19"/>
-                <w:szCs w:val="19"/>
-              </w:rPr>
-              <w:t>Acta de cierre y aceptación</w:t>
+            <w:shd w:val="clear" w:color="auto" w:fill="FFFFFF"/>
+            <w:tcMar>
+              <w:top w:w="50" w:type="dxa"/>
+              <w:left w:w="100" w:type="dxa"/>
+              <w:bottom w:w="50" w:type="dxa"/>
+              <w:right w:w="100" w:type="dxa"/>
+            </w:tcMar>
+            <w:vAlign w:val="center"/>
+          </w:tcPr>
+          <w:p>
+            <w:pPr>
+              <w:spacing w:line="260" w:lineRule="auto"/>
+            </w:pPr>
+            <w:r>
+              <w:rPr>
+                <w:sz w:val="19"/>
+                <w:szCs w:val="19"/>
+              </w:rPr>
+              <w:t xml:space="preserve">Acta de aceptación y cierre firmada</w:t>
             </w:r>
           </w:p>
         </w:tc>
         <w:tc>
           <w:tcPr>
             <w:tcW w:w="1800" w:type="dxa"/>
-            <w:shd w:val="clear" w:color="auto" w:fill="F2F2F2"/>
-            <w:tcMar>
-              <w:top w:w="50" w:type="dxa"/>
-              <w:left w:w="100" w:type="dxa"/>
-              <w:bottom w:w="50" w:type="dxa"/>
-              <w:right w:w="100" w:type="dxa"/>
-            </w:tcMar>
-            <w:vAlign w:val="center"/>
-          </w:tcPr>
-          <w:p>
-            <w:pPr>
-              <w:spacing w:line="260" w:lineRule="auto"/>
-            </w:pPr>
-            <w:r>
-              <w:rPr>
-                <w:sz w:val="19"/>
-                <w:szCs w:val="19"/>
-              </w:rPr>
-              <w:t>Mes 6</w:t>
+            <w:shd w:val="clear" w:color="auto" w:fill="FFFFFF"/>
+            <w:tcMar>
+              <w:top w:w="50" w:type="dxa"/>
+              <w:left w:w="100" w:type="dxa"/>
+              <w:bottom w:w="50" w:type="dxa"/>
+              <w:right w:w="100" w:type="dxa"/>
+            </w:tcMar>
+            <w:vAlign w:val="center"/>
+          </w:tcPr>
+          <w:p>
+            <w:pPr>
+              <w:spacing w:line="260" w:lineRule="auto"/>
+            </w:pPr>
+            <w:r>
+              <w:rPr>
+                <w:sz w:val="19"/>
+                <w:szCs w:val="19"/>
+              </w:rPr>
+              <w:t xml:space="preserve">15/01/2027</w:t>
             </w:r>
           </w:p>
         </w:tc>
@@ -2618,7 +2681,7 @@
         <w:jc w:val="both"/>
       </w:pPr>
       <w:r>
-        <w:t>El presupuesto que se presenta es una estimación de orden de magnitud a nivel de acta de constitución; será refinado durante la planificación detallada.</w:t>
+        <w:t xml:space="preserve">El presupuesto que se presenta es una estimación de orden de magnitud a nivel de acta de constitución, agrupada por los entregables de la EDT; será refinado durante la planificación detallada en la línea base de costos, sin exceder el monto autorizado más su tolerancia.</w:t>
       </w:r>
     </w:p>
     <w:tbl>
@@ -3233,6 +3296,7 @@
     <w:p>
       <w:pPr>
         <w:pStyle w:val="Ttulo1"/>
+        <w:keepNext/>
         <w:pBdr>
           <w:bottom w:val="single" w:sz="8" w:space="4" w:color="1F4E79"/>
         </w:pBdr>
@@ -3363,7 +3427,7 @@
                 <w:sz w:val="19"/>
                 <w:szCs w:val="19"/>
               </w:rPr>
-              <w:t xml:space="preserve">Gerencia General de Essenza SPA</w:t>
+              <w:t xml:space="preserve">Gerencia General (dueña) de Essenza SPA</w:t>
             </w:r>
           </w:p>
         </w:tc>
@@ -3388,7 +3452,7 @@
                 <w:sz w:val="19"/>
                 <w:szCs w:val="19"/>
               </w:rPr>
-              <w:t>Patrocinador; aprueba el acta, el presupuesto y los cambios mayores.</w:t>
+              <w:t xml:space="preserve">Patrocinadora; aprueba el acta, el presupuesto y los cambios mayores, y firma la aceptación.</w:t>
             </w:r>
           </w:p>
         </w:tc>
@@ -3403,50 +3467,50 @@
         <w:tc>
           <w:tcPr>
             <w:tcW w:w="4000" w:type="dxa"/>
-            <w:shd w:val="clear" w:color="auto" w:fill="F2F2F2"/>
-            <w:tcMar>
-              <w:top w:w="50" w:type="dxa"/>
-              <w:left w:w="100" w:type="dxa"/>
-              <w:bottom w:w="50" w:type="dxa"/>
-              <w:right w:w="100" w:type="dxa"/>
-            </w:tcMar>
-            <w:vAlign w:val="center"/>
-          </w:tcPr>
-          <w:p>
-            <w:pPr>
-              <w:spacing w:line="260" w:lineRule="auto"/>
-            </w:pPr>
-            <w:r>
-              <w:rPr>
-                <w:sz w:val="19"/>
-                <w:szCs w:val="19"/>
-              </w:rPr>
-              <w:t>Área de Marketing y Experiencia del Cliente</w:t>
+            <w:shd w:val="clear" w:color="auto" w:fill="FFFFFF"/>
+            <w:tcMar>
+              <w:top w:w="50" w:type="dxa"/>
+              <w:left w:w="100" w:type="dxa"/>
+              <w:bottom w:w="50" w:type="dxa"/>
+              <w:right w:w="100" w:type="dxa"/>
+            </w:tcMar>
+            <w:vAlign w:val="center"/>
+          </w:tcPr>
+          <w:p>
+            <w:pPr>
+              <w:spacing w:line="260" w:lineRule="auto"/>
+            </w:pPr>
+            <w:r>
+              <w:rPr>
+                <w:sz w:val="19"/>
+                <w:szCs w:val="19"/>
+              </w:rPr>
+              <w:t xml:space="preserve">Administradora</w:t>
             </w:r>
           </w:p>
         </w:tc>
         <w:tc>
           <w:tcPr>
             <w:tcW w:w="5020" w:type="dxa"/>
-            <w:shd w:val="clear" w:color="auto" w:fill="F2F2F2"/>
-            <w:tcMar>
-              <w:top w:w="50" w:type="dxa"/>
-              <w:left w:w="100" w:type="dxa"/>
-              <w:bottom w:w="50" w:type="dxa"/>
-              <w:right w:w="100" w:type="dxa"/>
-            </w:tcMar>
-            <w:vAlign w:val="center"/>
-          </w:tcPr>
-          <w:p>
-            <w:pPr>
-              <w:spacing w:line="260" w:lineRule="auto"/>
-            </w:pPr>
-            <w:r>
-              <w:rPr>
-                <w:sz w:val="19"/>
-                <w:szCs w:val="19"/>
-              </w:rPr>
-              <w:t>Usuario principal; define reglas de fidelización y campañas.</w:t>
+            <w:shd w:val="clear" w:color="auto" w:fill="FFFFFF"/>
+            <w:tcMar>
+              <w:top w:w="50" w:type="dxa"/>
+              <w:left w:w="100" w:type="dxa"/>
+              <w:bottom w:w="50" w:type="dxa"/>
+              <w:right w:w="100" w:type="dxa"/>
+            </w:tcMar>
+            <w:vAlign w:val="center"/>
+          </w:tcPr>
+          <w:p>
+            <w:pPr>
+              <w:spacing w:line="260" w:lineRule="auto"/>
+            </w:pPr>
+            <w:r>
+              <w:rPr>
+                <w:sz w:val="19"/>
+                <w:szCs w:val="19"/>
+              </w:rPr>
+              <w:t xml:space="preserve">Usuaria líder; valida requisitos, prototipos y pruebas de aceptación, y recibe la operación del CRM.</w:t>
             </w:r>
           </w:p>
         </w:tc>
@@ -3479,7 +3543,7 @@
                 <w:sz w:val="19"/>
                 <w:szCs w:val="19"/>
               </w:rPr>
-              <w:t>Personal de recepción y atención</w:t>
+              <w:t xml:space="preserve">Recepcionista y cosmiatras</w:t>
             </w:r>
           </w:p>
         </w:tc>
@@ -3504,7 +3568,7 @@
                 <w:sz w:val="19"/>
                 <w:szCs w:val="19"/>
               </w:rPr>
-              <w:t xml:space="preserve">Ejecutores de los protocolos de atención y del programa.</w:t>
+              <w:t xml:space="preserve">Usuarias operativas: registran en el Excel, revisan alertas y fichas, y contactan a los clientes.</w:t>
             </w:r>
           </w:p>
         </w:tc>
@@ -3519,50 +3583,50 @@
         <w:tc>
           <w:tcPr>
             <w:tcW w:w="4000" w:type="dxa"/>
-            <w:shd w:val="clear" w:color="auto" w:fill="F2F2F2"/>
-            <w:tcMar>
-              <w:top w:w="50" w:type="dxa"/>
-              <w:left w:w="100" w:type="dxa"/>
-              <w:bottom w:w="50" w:type="dxa"/>
-              <w:right w:w="100" w:type="dxa"/>
-            </w:tcMar>
-            <w:vAlign w:val="center"/>
-          </w:tcPr>
-          <w:p>
-            <w:pPr>
-              <w:spacing w:line="260" w:lineRule="auto"/>
-            </w:pPr>
-            <w:r>
-              <w:rPr>
-                <w:sz w:val="19"/>
-                <w:szCs w:val="19"/>
-              </w:rPr>
-              <w:t>Director del proyecto</w:t>
+            <w:shd w:val="clear" w:color="auto" w:fill="FFFFFF"/>
+            <w:tcMar>
+              <w:top w:w="50" w:type="dxa"/>
+              <w:left w:w="100" w:type="dxa"/>
+              <w:bottom w:w="50" w:type="dxa"/>
+              <w:right w:w="100" w:type="dxa"/>
+            </w:tcMar>
+            <w:vAlign w:val="center"/>
+          </w:tcPr>
+          <w:p>
+            <w:pPr>
+              <w:spacing w:line="260" w:lineRule="auto"/>
+            </w:pPr>
+            <w:r>
+              <w:rPr>
+                <w:sz w:val="19"/>
+                <w:szCs w:val="19"/>
+              </w:rPr>
+              <w:t xml:space="preserve">Director del proyecto</w:t>
             </w:r>
           </w:p>
         </w:tc>
         <w:tc>
           <w:tcPr>
             <w:tcW w:w="5020" w:type="dxa"/>
-            <w:shd w:val="clear" w:color="auto" w:fill="F2F2F2"/>
-            <w:tcMar>
-              <w:top w:w="50" w:type="dxa"/>
-              <w:left w:w="100" w:type="dxa"/>
-              <w:bottom w:w="50" w:type="dxa"/>
-              <w:right w:w="100" w:type="dxa"/>
-            </w:tcMar>
-            <w:vAlign w:val="center"/>
-          </w:tcPr>
-          <w:p>
-            <w:pPr>
-              <w:spacing w:line="260" w:lineRule="auto"/>
-            </w:pPr>
-            <w:r>
-              <w:rPr>
-                <w:sz w:val="19"/>
-                <w:szCs w:val="19"/>
-              </w:rPr>
-              <w:t>Responsable de planificar, ejecutar y controlar el proyecto.</w:t>
+            <w:shd w:val="clear" w:color="auto" w:fill="FFFFFF"/>
+            <w:tcMar>
+              <w:top w:w="50" w:type="dxa"/>
+              <w:left w:w="100" w:type="dxa"/>
+              <w:bottom w:w="50" w:type="dxa"/>
+              <w:right w:w="100" w:type="dxa"/>
+            </w:tcMar>
+            <w:vAlign w:val="center"/>
+          </w:tcPr>
+          <w:p>
+            <w:pPr>
+              <w:spacing w:line="260" w:lineRule="auto"/>
+            </w:pPr>
+            <w:r>
+              <w:rPr>
+                <w:sz w:val="19"/>
+                <w:szCs w:val="19"/>
+              </w:rPr>
+              <w:t xml:space="preserve">Responsable de planificar, ejecutar y controlar el proyecto.</w:t>
             </w:r>
           </w:p>
         </w:tc>
@@ -3620,7 +3684,7 @@
                 <w:sz w:val="19"/>
                 <w:szCs w:val="19"/>
               </w:rPr>
-              <w:t xml:space="preserve">Diagnostica, diseña e implementa el programa y los procesos.</w:t>
+              <w:t xml:space="preserve">Analista funcional, científico de datos, desarrolladores backend y frontend, QA y capacitación.</w:t>
             </w:r>
           </w:p>
         </w:tc>
@@ -3635,7 +3699,7 @@
         <w:tc>
           <w:tcPr>
             <w:tcW w:w="4000" w:type="dxa"/>
-            <w:shd w:val="clear" w:color="auto" w:fill="F2F2F2"/>
+            <w:shd w:val="clear" w:color="auto" w:fill="FFFFFF"/>
             <w:tcMar>
               <w:top w:w="50" w:type="dxa"/>
               <w:left w:w="100" w:type="dxa"/>
@@ -3660,25 +3724,25 @@
         <w:tc>
           <w:tcPr>
             <w:tcW w:w="5020" w:type="dxa"/>
-            <w:shd w:val="clear" w:color="auto" w:fill="F2F2F2"/>
-            <w:tcMar>
-              <w:top w:w="50" w:type="dxa"/>
-              <w:left w:w="100" w:type="dxa"/>
-              <w:bottom w:w="50" w:type="dxa"/>
-              <w:right w:w="100" w:type="dxa"/>
-            </w:tcMar>
-            <w:vAlign w:val="center"/>
-          </w:tcPr>
-          <w:p>
-            <w:pPr>
-              <w:spacing w:line="260" w:lineRule="auto"/>
-            </w:pPr>
-            <w:r>
-              <w:rPr>
-                <w:sz w:val="19"/>
-                <w:szCs w:val="19"/>
-              </w:rPr>
-              <w:t>Beneficiarios finales del programa de fidelización.</w:t>
+            <w:shd w:val="clear" w:color="auto" w:fill="FFFFFF"/>
+            <w:tcMar>
+              <w:top w:w="50" w:type="dxa"/>
+              <w:left w:w="100" w:type="dxa"/>
+              <w:bottom w:w="50" w:type="dxa"/>
+              <w:right w:w="100" w:type="dxa"/>
+            </w:tcMar>
+            <w:vAlign w:val="center"/>
+          </w:tcPr>
+          <w:p>
+            <w:pPr>
+              <w:spacing w:line="260" w:lineRule="auto"/>
+            </w:pPr>
+            <w:r>
+              <w:rPr>
+                <w:sz w:val="19"/>
+                <w:szCs w:val="19"/>
+              </w:rPr>
+              <w:t xml:space="preserve">Beneficiarios finales y titulares de los datos personales.</w:t>
             </w:r>
           </w:p>
         </w:tc>
@@ -3687,6 +3751,7 @@
     <w:p>
       <w:pPr>
         <w:pStyle w:val="Ttulo1"/>
+        <w:keepNext/>
         <w:pBdr>
           <w:bottom w:val="single" w:sz="8" w:space="4" w:color="1F4E79"/>
         </w:pBdr>
@@ -3784,6 +3849,7 @@
     <w:p>
       <w:pPr>
         <w:pStyle w:val="Ttulo1"/>
+        <w:keepNext/>
         <w:pBdr>
           <w:bottom w:val="single" w:sz="8" w:space="4" w:color="1F4E79"/>
         </w:pBdr>
@@ -3806,7 +3872,7 @@
         <w:jc w:val="both"/>
       </w:pPr>
       <w:r>
-        <w:t xml:space="preserve">El proyecto se considerará exitosamente concluido cuando se cumplan los criterios de éxito de la sección 4, el programa de fidelización y los protocolos estén en funcionamiento, el personal esté capacitado y el patrocinador firme el acta de aceptación y cierre del proyecto.</w:t>
+        <w:t xml:space="preserve">El proyecto se considerará exitosamente concluido cuando se cumplan los criterios de éxito de la sección 4, el CRM esté en producción en el spa con 0 incidentes críticos abiertos, las usuarias estén capacitadas, la operación haya sido transferida a la administradora y la patrocinadora firme el acta de aceptación y cierre del proyecto.</w:t>
       </w:r>
     </w:p>
     <w:p>
@@ -3832,7 +3898,6 @@
     <w:p>
       <w:pPr>
         <w:spacing w:after="240" w:line="276" w:lineRule="auto"/>
-        <w:keepNext/>
         <w:jc w:val="both"/>
       </w:pPr>
       <w:r>
@@ -4174,7 +4239,7 @@
         <w:sz w:val="16"/>
         <w:szCs w:val="16"/>
       </w:rPr>
-      <w:t xml:space="preserve">Código: ESSENZA-FID-2026-001   |   Página </w:t>
+      <w:t xml:space="preserve">Código: ESSENZA-CRM-2026-001   |   Página </w:t>
     </w:r>
     <w:r>
       <w:rPr>

</xml_diff>